<commit_message>
0.6.0: folders like Jupyter, tabs, one model across diagrams, checks, PlantUML in, company colours
- The list is a file browser: folders are projects, every file shows; tabs for open diagrams
- Sequence diagrams know the folder's class diagrams: suggestions, marks, one-click fixes
- UML checks on use case, class, activity, state and communication diagrams
- Class and use case diagrams can be typed as PlantUML
- Per-folder colour palettes (presets, hex codes, from a logo), Colour by kind
- Diagrams fill the window and keep fitting as it changes size
- Fixes from review: listing races with moves, folder delete keeps hidden files,
  copies land next to the original, leading-dot folder names, tabs follow moved files

Co-Authored-By: Claude Opus 5.5 <noreply@anthropic.com>
</commit_message>
<xml_diff>
--- a/examples/E1/ejemplo-biblioya-e1-memoria.docx
+++ b/examples/E1/ejemplo-biblioya-e1-memoria.docx
@@ -16,7 +16,7 @@
           <w:i/>
           <w:iCs/>
         </w:rPr>
-        <w:t xml:space="preserve">Exportado con se-ramify el 20/10/2026.</w:t>
+        <w:t xml:space="preserve">Exportado con se-ramify el 23/10/2026.</w:t>
       </w:r>
     </w:p>
     <w:p>
@@ -641,7 +641,7 @@
       <w:r>
         <w:drawing>
           <wp:inline distT="0" distB="0" distL="0" distR="0">
-            <wp:extent cx="5972175" cy="4076700"/>
+            <wp:extent cx="5972175" cy="3895725"/>
             <wp:effectExtent t="0" r="0" b="0" l="0"/>
             <wp:docPr id="1" name="01-e1-modelo-de-negocio-faro-software.png" descr="E1 · Modelo de negocio — Faro Software" title="E1 · Modelo de negocio — Faro Software"/>
             <wp:cNvGraphicFramePr>
@@ -666,7 +666,7 @@
                   <pic:spPr bwMode="auto">
                     <a:xfrm>
                       <a:off x="0" y="0"/>
-                      <a:ext cx="5972175" cy="4076700"/>
+                      <a:ext cx="5972175" cy="3895725"/>
                     </a:xfrm>
                     <a:prstGeom prst="rect">
                       <a:avLst/>

</xml_diff>